<commit_message>
Add platform-migration section to the Word user guide
Adds an "Advanced: Moving accounts to a different platform" section with a
worked CHEP-90-DOM -> CHEP-60-DOM example (export with -PlatformID, backup,
edit, -WhatIf preview, pilot, apply, and rollback), plus the compatibility/
required-property/safe caveats and a matching troubleshooting row.

https://claude.ai/code/session_01RSZpakmozrVP9UNmAu4xcT
</commit_message>
<xml_diff>
--- a/Account Property Management/CyberArk Account Field Updater - User Guide.docx
+++ b/Account Property Management/CyberArk Account Field Updater - User Guide.docx
@@ -639,6 +639,352 @@
         <w:pStyle w:val="Heading1"/>
       </w:pPr>
       <w:r>
+        <w:t>Advanced: Moving accounts to a different platform</w:t>
+      </w:r>
+    </w:p>
+    <w:p>
+      <w:r>
+        <w:rPr>
+          <w:b w:val="0"/>
+          <w:i w:val="0"/>
+        </w:rPr>
+        <w:t>Besides descriptive fields, this tool can also change an account’s platform assignment — for example, moving every account on one platform onto another. This is more powerful than editing Address or Notes, so please read the cautions before you begin.</w:t>
+      </w:r>
+    </w:p>
+    <w:p>
+      <w:r>
+        <w:rPr>
+          <w:b/>
+          <w:i w:val="0"/>
+        </w:rPr>
+        <w:t>Please note:</w:t>
+      </w:r>
+    </w:p>
+    <w:p>
+      <w:pPr>
+        <w:pStyle w:val="ListBullet"/>
+      </w:pPr>
+      <w:r>
+        <w:t>It only works between compatible platforms — for example, one Windows domain platform to another Windows domain platform. Moving between very different platforms (such as Windows to Unix) will be rejected by CyberArk.</w:t>
+      </w:r>
+    </w:p>
+    <w:p>
+      <w:pPr>
+        <w:pStyle w:val="ListBullet"/>
+      </w:pPr>
+      <w:r>
+        <w:t>The target platform must already exist and be active in CyberArk.</w:t>
+      </w:r>
+    </w:p>
+    <w:p>
+      <w:pPr>
+        <w:pStyle w:val="ListBullet"/>
+      </w:pPr>
+      <w:r>
+        <w:t>It changes only the platform; it does not move accounts to a different safe.</w:t>
+      </w:r>
+    </w:p>
+    <w:p>
+      <w:pPr>
+        <w:pStyle w:val="ListBullet"/>
+      </w:pPr>
+      <w:r>
+        <w:t>If the new platform requires extra mandatory fields, you may need to fill those in too (see the last step).</w:t>
+      </w:r>
+    </w:p>
+    <w:p>
+      <w:pPr>
+        <w:pStyle w:val="ListBullet"/>
+      </w:pPr>
+      <w:r>
+        <w:t>Always preview with -WhatIf, and test on a few accounts before doing them all.</w:t>
+      </w:r>
+    </w:p>
+    <w:p>
+      <w:pPr>
+        <w:pStyle w:val="Heading2"/>
+      </w:pPr>
+      <w:r>
+        <w:t>Example: move all CHEP-90-DOM accounts to CHEP-60-DOM</w:t>
+      </w:r>
+    </w:p>
+    <w:p>
+      <w:r>
+        <w:rPr>
+          <w:b w:val="0"/>
+          <w:i w:val="0"/>
+        </w:rPr>
+        <w:t>1. Export only the accounts on the old platform. The -PlatformID option pulls just those accounts:</w:t>
+      </w:r>
+    </w:p>
+    <w:tbl>
+      <w:tblPr>
+        <w:tblStyle w:val="TableGrid"/>
+        <w:tblW w:type="auto" w:w="0"/>
+        <w:tblLook w:firstColumn="1" w:firstRow="1" w:lastColumn="0" w:lastRow="0" w:noHBand="0" w:noVBand="1" w:val="04A0"/>
+      </w:tblPr>
+      <w:tblGrid>
+        <w:gridCol w:w="8640"/>
+      </w:tblGrid>
+      <w:tr>
+        <w:tc>
+          <w:tcPr>
+            <w:tcW w:type="dxa" w:w="8640"/>
+            <w:shd w:val="clear" w:color="auto" w:fill="F3F3F3"/>
+          </w:tcPr>
+          <w:p>
+            <w:pPr>
+              <w:spacing w:after="0"/>
+            </w:pPr>
+            <w:r>
+              <w:rPr>
+                <w:rFonts w:ascii="Consolas" w:hAnsi="Consolas"/>
+                <w:sz w:val="19"/>
+              </w:rPr>
+              <w:t>.\Export-CyberArkAccountsToCsv.ps1 -PVWAUrl 'https://brambles.privilegecloud.cyberark.cloud/passwordvault' -IdentityUserName 'johnc@cyberark.cloud.38599' -PlatformID 'CHEP-90-DOM' -OutputCsv .\platform-move.csv</w:t>
+            </w:r>
+          </w:p>
+        </w:tc>
+      </w:tr>
+    </w:tbl>
+    <w:p/>
+    <w:p>
+      <w:r>
+        <w:rPr>
+          <w:b w:val="0"/>
+          <w:i w:val="0"/>
+        </w:rPr>
+        <w:t>This creates platform-move.csv containing only the CHEP-90-DOM accounts.</w:t>
+      </w:r>
+    </w:p>
+    <w:p>
+      <w:r>
+        <w:rPr>
+          <w:b w:val="0"/>
+          <w:i w:val="0"/>
+        </w:rPr>
+        <w:t>2. Make a backup. Copy platform-move.csv to platform-move-ORIGINAL.csv and leave that copy untouched. It still contains the old platform (CHEP-90-DOM) and is your safety net if you ever need to undo the change.</w:t>
+      </w:r>
+    </w:p>
+    <w:p>
+      <w:r>
+        <w:rPr>
+          <w:b w:val="0"/>
+          <w:i w:val="0"/>
+        </w:rPr>
+        <w:t>3. Edit the spreadsheet. Open platform-move.csv in Excel. In the PlatformID column, change every value from CHEP-90-DOM to CHEP-60-DOM (type it into the first cell and fill down, or use Find &amp; Replace). Leave the AccountID column alone, then save (keep the .csv format).</w:t>
+      </w:r>
+    </w:p>
+    <w:p>
+      <w:r>
+        <w:rPr>
+          <w:b w:val="0"/>
+          <w:i w:val="0"/>
+        </w:rPr>
+        <w:t>4. Preview the change. Nothing is written yet:</w:t>
+      </w:r>
+    </w:p>
+    <w:tbl>
+      <w:tblPr>
+        <w:tblStyle w:val="TableGrid"/>
+        <w:tblW w:type="auto" w:w="0"/>
+        <w:tblLook w:firstColumn="1" w:firstRow="1" w:lastColumn="0" w:lastRow="0" w:noHBand="0" w:noVBand="1" w:val="04A0"/>
+      </w:tblPr>
+      <w:tblGrid>
+        <w:gridCol w:w="8640"/>
+      </w:tblGrid>
+      <w:tr>
+        <w:tc>
+          <w:tcPr>
+            <w:tcW w:type="dxa" w:w="8640"/>
+            <w:shd w:val="clear" w:color="auto" w:fill="F3F3F3"/>
+          </w:tcPr>
+          <w:p>
+            <w:pPr>
+              <w:spacing w:after="0"/>
+            </w:pPr>
+            <w:r>
+              <w:rPr>
+                <w:rFonts w:ascii="Consolas" w:hAnsi="Consolas"/>
+                <w:sz w:val="19"/>
+              </w:rPr>
+              <w:t>.\Import-CyberArkAccountPropertyUpdates.ps1 -PVWAUrl 'https://brambles.privilegecloud.cyberark.cloud/passwordvault' -IdentityUserName 'johnc@cyberark.cloud.38599' -InputCsv .\platform-move.csv -PropertiesToUpdate PlatformID -WhatIf</w:t>
+            </w:r>
+          </w:p>
+        </w:tc>
+      </w:tr>
+    </w:tbl>
+    <w:p/>
+    <w:p>
+      <w:r>
+        <w:rPr>
+          <w:b w:val="0"/>
+          <w:i w:val="0"/>
+        </w:rPr>
+        <w:t>You will see a line for each account, for example:</w:t>
+      </w:r>
+    </w:p>
+    <w:p>
+      <w:r>
+        <w:rPr>
+          <w:b w:val="0"/>
+          <w:i/>
+        </w:rPr>
+        <w:t>Row 1 [242_259] … PLATFORM CHANGE -&gt; 'CHEP-60-DOM'</w:t>
+      </w:r>
+    </w:p>
+    <w:p>
+      <w:r>
+        <w:rPr>
+          <w:b w:val="0"/>
+          <w:i w:val="0"/>
+        </w:rPr>
+        <w:t>5. Test on a few first (recommended). Save two or three rows (with the header row) as a small file named platform-move-pilot.csv, run the same import command on that file without -WhatIf, then check in CyberArk that those accounts now show CHEP-60-DOM and are still healthy. Only continue once the test looks good.</w:t>
+      </w:r>
+    </w:p>
+    <w:tbl>
+      <w:tblPr>
+        <w:tblStyle w:val="TableGrid"/>
+        <w:tblW w:type="auto" w:w="0"/>
+        <w:tblLook w:firstColumn="1" w:firstRow="1" w:lastColumn="0" w:lastRow="0" w:noHBand="0" w:noVBand="1" w:val="04A0"/>
+      </w:tblPr>
+      <w:tblGrid>
+        <w:gridCol w:w="8640"/>
+      </w:tblGrid>
+      <w:tr>
+        <w:tc>
+          <w:tcPr>
+            <w:tcW w:type="dxa" w:w="8640"/>
+            <w:shd w:val="clear" w:color="auto" w:fill="F3F3F3"/>
+          </w:tcPr>
+          <w:p>
+            <w:pPr>
+              <w:spacing w:after="0"/>
+            </w:pPr>
+            <w:r>
+              <w:rPr>
+                <w:rFonts w:ascii="Consolas" w:hAnsi="Consolas"/>
+                <w:sz w:val="19"/>
+              </w:rPr>
+              <w:t>.\Import-CyberArkAccountPropertyUpdates.ps1 -PVWAUrl 'https://brambles.privilegecloud.cyberark.cloud/passwordvault' -IdentityUserName 'johnc@cyberark.cloud.38599' -InputCsv .\platform-move-pilot.csv -PropertiesToUpdate PlatformID</w:t>
+            </w:r>
+          </w:p>
+        </w:tc>
+      </w:tr>
+    </w:tbl>
+    <w:p/>
+    <w:p>
+      <w:r>
+        <w:rPr>
+          <w:b w:val="0"/>
+          <w:i w:val="0"/>
+        </w:rPr>
+        <w:t>6. Apply to all. When the test looks good, run the full file for real:</w:t>
+      </w:r>
+    </w:p>
+    <w:tbl>
+      <w:tblPr>
+        <w:tblStyle w:val="TableGrid"/>
+        <w:tblW w:type="auto" w:w="0"/>
+        <w:tblLook w:firstColumn="1" w:firstRow="1" w:lastColumn="0" w:lastRow="0" w:noHBand="0" w:noVBand="1" w:val="04A0"/>
+      </w:tblPr>
+      <w:tblGrid>
+        <w:gridCol w:w="8640"/>
+      </w:tblGrid>
+      <w:tr>
+        <w:tc>
+          <w:tcPr>
+            <w:tcW w:type="dxa" w:w="8640"/>
+            <w:shd w:val="clear" w:color="auto" w:fill="F3F3F3"/>
+          </w:tcPr>
+          <w:p>
+            <w:pPr>
+              <w:spacing w:after="0"/>
+            </w:pPr>
+            <w:r>
+              <w:rPr>
+                <w:rFonts w:ascii="Consolas" w:hAnsi="Consolas"/>
+                <w:sz w:val="19"/>
+              </w:rPr>
+              <w:t>.\Import-CyberArkAccountPropertyUpdates.ps1 -PVWAUrl 'https://brambles.privilegecloud.cyberark.cloud/passwordvault' -IdentityUserName 'johnc@cyberark.cloud.38599' -InputCsv .\platform-move.csv -PropertiesToUpdate PlatformID -LogPath .\platform-move.log</w:t>
+            </w:r>
+          </w:p>
+        </w:tc>
+      </w:tr>
+    </w:tbl>
+    <w:p/>
+    <w:p>
+      <w:r>
+        <w:rPr>
+          <w:b w:val="0"/>
+          <w:i w:val="0"/>
+        </w:rPr>
+        <w:t>Check the summary line and open platform-move.results.csv for any rows that did not succeed.</w:t>
+      </w:r>
+    </w:p>
+    <w:p>
+      <w:r>
+        <w:rPr>
+          <w:b/>
+          <w:i w:val="0"/>
+        </w:rPr>
+        <w:t>If you need to undo it:</w:t>
+      </w:r>
+    </w:p>
+    <w:p>
+      <w:r>
+        <w:rPr>
+          <w:b w:val="0"/>
+          <w:i w:val="0"/>
+        </w:rPr>
+        <w:t>To move everything back to CHEP-90-DOM, import the backup you made in step 2:</w:t>
+      </w:r>
+    </w:p>
+    <w:tbl>
+      <w:tblPr>
+        <w:tblStyle w:val="TableGrid"/>
+        <w:tblW w:type="auto" w:w="0"/>
+        <w:tblLook w:firstColumn="1" w:firstRow="1" w:lastColumn="0" w:lastRow="0" w:noHBand="0" w:noVBand="1" w:val="04A0"/>
+      </w:tblPr>
+      <w:tblGrid>
+        <w:gridCol w:w="8640"/>
+      </w:tblGrid>
+      <w:tr>
+        <w:tc>
+          <w:tcPr>
+            <w:tcW w:type="dxa" w:w="8640"/>
+            <w:shd w:val="clear" w:color="auto" w:fill="F3F3F3"/>
+          </w:tcPr>
+          <w:p>
+            <w:pPr>
+              <w:spacing w:after="0"/>
+            </w:pPr>
+            <w:r>
+              <w:rPr>
+                <w:rFonts w:ascii="Consolas" w:hAnsi="Consolas"/>
+                <w:sz w:val="19"/>
+              </w:rPr>
+              <w:t>.\Import-CyberArkAccountPropertyUpdates.ps1 -PVWAUrl 'https://brambles.privilegecloud.cyberark.cloud/passwordvault' -IdentityUserName 'johnc@cyberark.cloud.38599' -InputCsv .\platform-move-ORIGINAL.csv -PropertiesToUpdate PlatformID</w:t>
+            </w:r>
+          </w:p>
+        </w:tc>
+      </w:tr>
+    </w:tbl>
+    <w:p/>
+    <w:p>
+      <w:r>
+        <w:rPr>
+          <w:b w:val="0"/>
+          <w:i/>
+        </w:rPr>
+        <w:t>If some accounts show an Error about a missing or required property, the new platform needs a field the old one didn’t have. Add a column for that field in the spreadsheet, fill it in, and include it in the run — for example -PropertiesToUpdate PlatformID,&lt;FieldName&gt;.</w:t>
+      </w:r>
+    </w:p>
+    <w:p>
+      <w:pPr>
+        <w:pStyle w:val="Heading1"/>
+      </w:pPr>
+      <w:r>
         <w:t>Important safety notes</w:t>
       </w:r>
     </w:p>
@@ -812,6 +1158,28 @@
           <w:p>
             <w:r>
               <w:t>That account no longer exists in CyberArk; it is safe to ignore or remove that row.</w:t>
+            </w:r>
+          </w:p>
+        </w:tc>
+      </w:tr>
+      <w:tr>
+        <w:tc>
+          <w:tcPr>
+            <w:tcW w:type="dxa" w:w="4320"/>
+          </w:tcPr>
+          <w:p>
+            <w:r>
+              <w:t>A platform change row shows Error</w:t>
+            </w:r>
+          </w:p>
+        </w:tc>
+        <w:tc>
+          <w:tcPr>
+            <w:tcW w:type="dxa" w:w="4320"/>
+          </w:tcPr>
+          <w:p>
+            <w:r>
+              <w:t>The target platform may be incompatible, inactive, or missing a required field. Confirm the platform ID is correct and active, and add any required-property columns (see the platform section).</w:t>
             </w:r>
           </w:p>
         </w:tc>

</xml_diff>